<commit_message>
Whoops added the executable before testing it. Should work properly now (mac only)
</commit_message>
<xml_diff>
--- a/Cover_Page.docx
+++ b/Cover_Page.docx
@@ -327,160 +327,37 @@
       </w:r>
     </w:p>
     <w:p>
-      <w:r>
-        <w:rPr>
-          <w:sz w:val="24"/>
-        </w:rPr>
-        <w:t xml:space="preserve">5. Executable File name [                                              </w:t>
-      </w:r>
-      <w:proofErr w:type="gramStart"/>
-      <w:r>
-        <w:rPr>
-          <w:sz w:val="24"/>
-        </w:rPr>
-        <w:t xml:space="preserve">  ]</w:t>
-      </w:r>
-      <w:proofErr w:type="gramEnd"/>
+      <w:pPr>
+        <w:rPr>
+          <w:sz w:val="24"/>
+        </w:rPr>
+      </w:pPr>
+      <w:r>
+        <w:rPr>
+          <w:sz w:val="24"/>
+        </w:rPr>
+        <w:t>5. Executable File name</w:t>
+      </w:r>
+      <w:r>
+        <w:rPr>
+          <w:sz w:val="24"/>
+        </w:rPr>
+        <w:t>:</w:t>
+      </w:r>
       <w:r>
         <w:rPr>
           <w:sz w:val="24"/>
         </w:rPr>
         <w:t xml:space="preserve"> </w:t>
       </w:r>
-    </w:p>
-    <w:p>
-      <w:r>
-        <w:rPr>
-          <w:color w:val="FF0000"/>
-          <w:sz w:val="24"/>
-        </w:rPr>
-        <w:t xml:space="preserve"> </w:t>
-      </w:r>
-      <w:r>
-        <w:rPr>
-          <w:color w:val="FF0000"/>
-          <w:sz w:val="24"/>
-          <w:u w:val="single"/>
-        </w:rPr>
-        <w:t>(</w:t>
-      </w:r>
-      <w:r>
-        <w:rPr>
-          <w:b/>
-          <w:color w:val="FF0000"/>
-          <w:sz w:val="24"/>
-          <w:u w:val="single"/>
-        </w:rPr>
-        <w:t>A file that can be executed without compilation by the instructor</w:t>
-      </w:r>
-      <w:r>
-        <w:rPr>
-          <w:b/>
-          <w:color w:val="FF0000"/>
-          <w:sz w:val="24"/>
-          <w:u w:val="single"/>
-        </w:rPr>
-        <w:t xml:space="preserve">, such as .exe, .jar, </w:t>
-      </w:r>
-      <w:proofErr w:type="spellStart"/>
-      <w:proofErr w:type="gramStart"/>
-      <w:r>
-        <w:rPr>
-          <w:b/>
-          <w:color w:val="FF0000"/>
-          <w:sz w:val="24"/>
-          <w:u w:val="single"/>
-        </w:rPr>
-        <w:t>etc</w:t>
-      </w:r>
-      <w:proofErr w:type="spellEnd"/>
-      <w:r>
-        <w:rPr>
-          <w:color w:val="FF0000"/>
-          <w:sz w:val="24"/>
-          <w:u w:val="single"/>
-        </w:rPr>
-        <w:t xml:space="preserve"> </w:t>
-      </w:r>
-      <w:r>
-        <w:rPr>
-          <w:color w:val="FF0000"/>
-          <w:sz w:val="24"/>
-        </w:rPr>
-        <w:t xml:space="preserve"> </w:t>
-      </w:r>
-      <w:r>
-        <w:rPr>
-          <w:color w:val="FF0000"/>
-          <w:sz w:val="24"/>
-        </w:rPr>
-        <w:t>-</w:t>
-      </w:r>
-      <w:proofErr w:type="gramEnd"/>
-      <w:r>
-        <w:rPr>
-          <w:color w:val="FF0000"/>
-          <w:sz w:val="24"/>
-        </w:rPr>
-        <w:t xml:space="preserve"> </w:t>
-      </w:r>
-      <w:r>
-        <w:rPr>
-          <w:color w:val="FF0000"/>
-          <w:sz w:val="24"/>
-        </w:rPr>
-        <w:t xml:space="preserve"> </w:t>
-      </w:r>
-      <w:r>
-        <w:rPr>
-          <w:b/>
-          <w:bCs/>
-          <w:color w:val="FF0000"/>
-          <w:sz w:val="24"/>
-          <w:u w:val="single"/>
-        </w:rPr>
-        <w:t>NOT</w:t>
-      </w:r>
-      <w:r>
-        <w:rPr>
-          <w:color w:val="FF0000"/>
-          <w:sz w:val="24"/>
-        </w:rPr>
-        <w:t xml:space="preserve"> a source file such as .</w:t>
-      </w:r>
-      <w:proofErr w:type="spellStart"/>
-      <w:proofErr w:type="gramStart"/>
-      <w:r>
-        <w:rPr>
-          <w:color w:val="FF0000"/>
-          <w:sz w:val="24"/>
-        </w:rPr>
-        <w:t>cpp</w:t>
-      </w:r>
-      <w:proofErr w:type="spellEnd"/>
-      <w:r>
-        <w:rPr>
-          <w:color w:val="FF0000"/>
-          <w:sz w:val="24"/>
-        </w:rPr>
-        <w:t xml:space="preserve"> </w:t>
-      </w:r>
-      <w:r>
-        <w:rPr>
-          <w:color w:val="FF0000"/>
-          <w:sz w:val="24"/>
-        </w:rPr>
-        <w:t>)</w:t>
-      </w:r>
-      <w:proofErr w:type="gramEnd"/>
-    </w:p>
-    <w:p>
-      <w:pPr>
-        <w:rPr>
-          <w:sz w:val="24"/>
-        </w:rPr>
-      </w:pPr>
-    </w:p>
+      <w:r>
+        <w:rPr>
+          <w:sz w:val="24"/>
+        </w:rPr>
+        <w:t>main.exe</w:t>
+      </w:r>
+    </w:p>
+    <w:p/>
     <w:p>
       <w:pPr>
         <w:rPr>
@@ -830,7 +707,7 @@
           </mc:Choice>
           <mc:Fallback>
             <w:pict>
-              <v:line w14:anchorId="0F0060B2" id="Line 2" o:spid="_x0000_s1026" style="position:absolute;z-index:251659264;visibility:visible;mso-wrap-style:square;mso-width-percent:0;mso-height-percent:0;mso-wrap-distance-left:9pt;mso-wrap-distance-top:0;mso-wrap-distance-right:9pt;mso-wrap-distance-bottom:0;mso-position-horizontal:absolute;mso-position-horizontal-relative:text;mso-position-vertical:absolute;mso-position-vertical-relative:text;mso-width-percent:0;mso-height-percent:0;mso-width-relative:page;mso-height-relative:page" from="-4.95pt,10.15pt" to="445.05pt,10.15pt" o:gfxdata="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">
+              <v:line w14:anchorId="7940B649" id="Line 2" o:spid="_x0000_s1026" style="position:absolute;z-index:251659264;visibility:visible;mso-wrap-style:square;mso-width-percent:0;mso-height-percent:0;mso-wrap-distance-left:9pt;mso-wrap-distance-top:0;mso-wrap-distance-right:9pt;mso-wrap-distance-bottom:0;mso-position-horizontal:absolute;mso-position-horizontal-relative:text;mso-position-vertical:absolute;mso-position-vertical-relative:text;mso-width-percent:0;mso-height-percent:0;mso-width-relative:page;mso-height-relative:page" from="-4.95pt,10.15pt" to="445.05pt,10.15pt" o:gfxdata="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">
                 <o:lock v:ext="edit" shapetype="f"/>
               </v:line>
             </w:pict>

</xml_diff>

<commit_message>
Bug fixes: Fixed improper format for R1 Fixed reading print and scan (R20/R21) Made outputs specific, consistent, and included epsilon outputs.
</commit_message>
<xml_diff>
--- a/Cover_Page.docx
+++ b/Cover_Page.docx
@@ -56,13 +56,7 @@
         <w:rPr>
           <w:sz w:val="24"/>
         </w:rPr>
-        <w:t>1.   Names</w:t>
-      </w:r>
-      <w:r>
-        <w:rPr>
-          <w:sz w:val="24"/>
-        </w:rPr>
-        <w:t xml:space="preserve">: </w:t>
+        <w:t xml:space="preserve">1.   Names: </w:t>
       </w:r>
       <w:r>
         <w:rPr>
@@ -132,44 +126,30 @@
           <w:lang w:eastAsia="ko-KR"/>
         </w:rPr>
         <w:tab/>
-        <w:t>S</w:t>
-      </w:r>
-      <w:r>
+        <w:t>Section 323-07 (T/TH 2:30p-3:45p)</w:t>
+      </w:r>
+    </w:p>
+    <w:p>
+      <w:pPr>
         <w:rPr>
           <w:sz w:val="24"/>
           <w:lang w:eastAsia="ko-KR"/>
         </w:rPr>
-        <w:t>ection 323-07 (T/TH 2:30p-3:45p)</w:t>
-      </w:r>
-    </w:p>
-    <w:p>
-      <w:pPr>
-        <w:rPr>
+      </w:pPr>
+      <w:r>
+        <w:rPr>
+          <w:rFonts w:hint="eastAsia"/>
           <w:sz w:val="24"/>
           <w:lang w:eastAsia="ko-KR"/>
         </w:rPr>
-      </w:pPr>
-      <w:r>
-        <w:rPr>
-          <w:rFonts w:hint="eastAsia"/>
+        <w:t xml:space="preserve">    </w:t>
+      </w:r>
+      <w:r>
+        <w:rPr>
           <w:sz w:val="24"/>
           <w:lang w:eastAsia="ko-KR"/>
         </w:rPr>
-        <w:t xml:space="preserve">    </w:t>
-      </w:r>
-      <w:r>
-        <w:rPr>
-          <w:sz w:val="24"/>
-          <w:lang w:eastAsia="ko-KR"/>
-        </w:rPr>
-        <w:t xml:space="preserve">              </w:t>
-      </w:r>
-      <w:r>
-        <w:rPr>
-          <w:sz w:val="24"/>
-          <w:lang w:eastAsia="ko-KR"/>
-        </w:rPr>
-        <w:t>Tony Lin</w:t>
+        <w:t xml:space="preserve">              Tony Lin</w:t>
       </w:r>
       <w:r>
         <w:rPr>
@@ -238,33 +218,51 @@
         <w:rPr>
           <w:sz w:val="24"/>
         </w:rPr>
-        <w:t>1</w:t>
-      </w:r>
-    </w:p>
-    <w:p>
-      <w:pPr>
-        <w:rPr>
-          <w:sz w:val="24"/>
-        </w:rPr>
-      </w:pPr>
-    </w:p>
-    <w:p>
-      <w:pPr>
-        <w:rPr>
-          <w:sz w:val="24"/>
-        </w:rPr>
-      </w:pPr>
-      <w:r>
-        <w:rPr>
-          <w:sz w:val="24"/>
-        </w:rPr>
-        <w:t xml:space="preserve">3. Due Date                    </w:t>
-      </w:r>
-      <w:r>
-        <w:rPr>
-          <w:sz w:val="24"/>
-        </w:rPr>
-        <w:t>03/01/26</w:t>
+        <w:t>2</w:t>
+      </w:r>
+    </w:p>
+    <w:p>
+      <w:pPr>
+        <w:rPr>
+          <w:sz w:val="24"/>
+        </w:rPr>
+      </w:pPr>
+    </w:p>
+    <w:p>
+      <w:pPr>
+        <w:rPr>
+          <w:sz w:val="24"/>
+        </w:rPr>
+      </w:pPr>
+      <w:r>
+        <w:rPr>
+          <w:sz w:val="24"/>
+        </w:rPr>
+        <w:t>3. Due Date                    0</w:t>
+      </w:r>
+      <w:r>
+        <w:rPr>
+          <w:sz w:val="24"/>
+        </w:rPr>
+        <w:t>4</w:t>
+      </w:r>
+      <w:r>
+        <w:rPr>
+          <w:sz w:val="24"/>
+        </w:rPr>
+        <w:t>/</w:t>
+      </w:r>
+      <w:r>
+        <w:rPr>
+          <w:sz w:val="24"/>
+        </w:rPr>
+        <w:t>05</w:t>
+      </w:r>
+      <w:r>
+        <w:rPr>
+          <w:sz w:val="24"/>
+        </w:rPr>
+        <w:t>/26</w:t>
       </w:r>
     </w:p>
     <w:p>
@@ -304,13 +302,31 @@
         <w:rPr>
           <w:sz w:val="24"/>
         </w:rPr>
-        <w:t xml:space="preserve">       </w:t>
-      </w:r>
-      <w:r>
-        <w:rPr>
-          <w:sz w:val="24"/>
-        </w:rPr>
-        <w:t>03/01/26</w:t>
+        <w:t xml:space="preserve">       0</w:t>
+      </w:r>
+      <w:r>
+        <w:rPr>
+          <w:sz w:val="24"/>
+        </w:rPr>
+        <w:t>4</w:t>
+      </w:r>
+      <w:r>
+        <w:rPr>
+          <w:sz w:val="24"/>
+        </w:rPr>
+        <w:t>/</w:t>
+      </w:r>
+      <w:r>
+        <w:rPr>
+          <w:sz w:val="24"/>
+        </w:rPr>
+        <w:t>05/</w:t>
+      </w:r>
+      <w:r>
+        <w:rPr>
+          <w:sz w:val="24"/>
+        </w:rPr>
+        <w:t>/26</w:t>
       </w:r>
     </w:p>
     <w:p>
@@ -416,13 +432,7 @@
           <w:sz w:val="24"/>
         </w:rPr>
         <w:tab/>
-        <w:t xml:space="preserve">testcase1.txt </w:t>
-      </w:r>
-      <w:r>
-        <w:rPr>
-          <w:sz w:val="24"/>
-        </w:rPr>
-        <w:t xml:space="preserve">    </w:t>
+        <w:t xml:space="preserve">testcase1.txt     </w:t>
       </w:r>
       <w:proofErr w:type="gramStart"/>
       <w:r>
@@ -465,25 +475,7 @@
           <w:sz w:val="24"/>
         </w:rPr>
         <w:tab/>
-        <w:t>t</w:t>
-      </w:r>
-      <w:r>
-        <w:rPr>
-          <w:sz w:val="24"/>
-        </w:rPr>
-        <w:t>estcase</w:t>
-      </w:r>
-      <w:r>
-        <w:rPr>
-          <w:sz w:val="24"/>
-        </w:rPr>
-        <w:t>2</w:t>
-      </w:r>
-      <w:r>
-        <w:rPr>
-          <w:sz w:val="24"/>
-        </w:rPr>
-        <w:t xml:space="preserve">.txt     </w:t>
+        <w:t xml:space="preserve">testcase2.txt     </w:t>
       </w:r>
       <w:proofErr w:type="gramStart"/>
       <w:r>
@@ -491,19 +483,7 @@
           <w:sz w:val="24"/>
         </w:rPr>
         <w:tab/>
-        <w:t xml:space="preserve">  testcase</w:t>
-      </w:r>
-      <w:r>
-        <w:rPr>
-          <w:sz w:val="24"/>
-        </w:rPr>
-        <w:t>2</w:t>
-      </w:r>
-      <w:r>
-        <w:rPr>
-          <w:sz w:val="24"/>
-        </w:rPr>
-        <w:t>_output.txt</w:t>
+        <w:t xml:space="preserve">  testcase2_output.txt</w:t>
       </w:r>
       <w:proofErr w:type="gramEnd"/>
     </w:p>
@@ -538,30 +518,7 @@
           <w:sz w:val="24"/>
         </w:rPr>
         <w:tab/>
-      </w:r>
-      <w:r>
-        <w:rPr>
-          <w:sz w:val="24"/>
-        </w:rPr>
-        <w:t>t</w:t>
-      </w:r>
-      <w:r>
-        <w:rPr>
-          <w:sz w:val="24"/>
-        </w:rPr>
-        <w:t>estcase</w:t>
-      </w:r>
-      <w:r>
-        <w:rPr>
-          <w:sz w:val="24"/>
-        </w:rPr>
-        <w:t>3</w:t>
-      </w:r>
-      <w:r>
-        <w:rPr>
-          <w:sz w:val="24"/>
-        </w:rPr>
-        <w:t xml:space="preserve">.txt     </w:t>
+        <w:t xml:space="preserve">testcase3.txt     </w:t>
       </w:r>
       <w:proofErr w:type="gramStart"/>
       <w:r>
@@ -569,19 +526,7 @@
           <w:sz w:val="24"/>
         </w:rPr>
         <w:tab/>
-        <w:t xml:space="preserve">  testcase</w:t>
-      </w:r>
-      <w:r>
-        <w:rPr>
-          <w:sz w:val="24"/>
-        </w:rPr>
-        <w:t>3</w:t>
-      </w:r>
-      <w:r>
-        <w:rPr>
-          <w:sz w:val="24"/>
-        </w:rPr>
-        <w:t>_output.txt</w:t>
+        <w:t xml:space="preserve">  testcase3_output.txt</w:t>
       </w:r>
       <w:proofErr w:type="gramEnd"/>
     </w:p>
@@ -610,13 +555,7 @@
         <w:rPr>
           <w:sz w:val="24"/>
         </w:rPr>
-        <w:t xml:space="preserve">7. Operating System   </w:t>
-      </w:r>
-      <w:r>
-        <w:rPr>
-          <w:sz w:val="24"/>
-        </w:rPr>
-        <w:t>Window or Mac</w:t>
+        <w:t>7. Operating System   Window or Mac</w:t>
       </w:r>
     </w:p>
     <w:p>

</xml_diff>